<commit_message>
docs: add comprehensive project report, dataset links, and docx documentation along with hub registry JSON
</commit_message>
<xml_diff>
--- a/docs/PROJECT_REPORT.docx
+++ b/docs/PROJECT_REPORT.docx
@@ -893,7 +893,18 @@
     </w:p>
     <w:p>
       <w:r>
-        <w:t>Each algorithmic implementation includes strict PEP 484 type annotations, formal docstrings detailing asymptotic time and space complexities (O(n \log n), O(V + E)), and explicit edge-case handling (empty inputs, zero denominators, boundary conditions).</w:t>
+        <w:t>Each algorithmic implementation includes strict PEP 484 type annotations, formal docstrings detailing asymptotic time and space complexities (O(n \log n), O(V + E)), and explicit edge-case handling (empty inputs, zero denominators, boundary conditions). A dedicated reference of in-repo dataset files and external benchmark links is documented in [</w:t>
+      </w:r>
+      <w:r>
+        <w:rPr>
+          <w:rFonts w:ascii="Consolas" w:hAnsi="Consolas"/>
+          <w:color w:val="0F172A"/>
+          <w:sz w:val="19"/>
+        </w:rPr>
+        <w:t>DATASET_LINKS.md</w:t>
+      </w:r>
+      <w:r>
+        <w:t>](file:///c:/Users/CSE-TECH-04/Desktop/zafor/projects/llm/docs/DATASET_LINKS.md).</w:t>
       </w:r>
     </w:p>
     <w:p>

</xml_diff>